<commit_message>
[reporting][subdocs]Udpataed layout templates, comment #639
</commit_message>
<xml_diff>
--- a/reporting/subdocs_templates/maturity_level_legend_template.docx
+++ b/reporting/subdocs_templates/maturity_level_legend_template.docx
@@ -30,6 +30,11 @@
           <w:tcPr>
             <w:tcW w:w="4390" w:type="dxa"/>
             <w:gridSpan w:val="2"/>
+            <w:tcBorders>
+              <w:top w:val="single" w:sz="4" w:space="0" w:color="FFFFFF" w:themeColor="background1"/>
+              <w:left w:val="single" w:sz="4" w:space="0" w:color="FFFFFF" w:themeColor="background1"/>
+              <w:right w:val="single" w:sz="4" w:space="0" w:color="FFFFFF" w:themeColor="background1"/>
+            </w:tcBorders>
             <w:vAlign w:val="center"/>
           </w:tcPr>
           <w:p>
@@ -55,8 +60,16 @@
               <w:rPr>
                 <w:lang w:val="en-US"/>
               </w:rPr>
-              <w:t xml:space="preserve"> for level in maturity_levels</w:t>
-            </w:r>
+              <w:t xml:space="preserve"> for level in </w:t>
+            </w:r>
+            <w:proofErr w:type="spellStart"/>
+            <w:r>
+              <w:rPr>
+                <w:lang w:val="en-US"/>
+              </w:rPr>
+              <w:t>maturity_levels</w:t>
+            </w:r>
+            <w:proofErr w:type="spellEnd"/>
             <w:r>
               <w:rPr>
                 <w:lang w:val="en-US"/>
@@ -73,6 +86,12 @@
         <w:tc>
           <w:tcPr>
             <w:tcW w:w="426" w:type="dxa"/>
+            <w:tcBorders>
+              <w:top w:val="single" w:sz="4" w:space="0" w:color="FFFFFF" w:themeColor="background1"/>
+              <w:left w:val="single" w:sz="4" w:space="0" w:color="FFFFFF" w:themeColor="background1"/>
+              <w:bottom w:val="single" w:sz="4" w:space="0" w:color="FFFFFF" w:themeColor="background1"/>
+              <w:right w:val="single" w:sz="4" w:space="0" w:color="FFFFFF" w:themeColor="background1"/>
+            </w:tcBorders>
             <w:vAlign w:val="center"/>
             <w:hideMark/>
           </w:tcPr>
@@ -91,12 +110,22 @@
               </w:rPr>
               <w:t xml:space="preserve">{% </w:t>
             </w:r>
-            <w:r>
-              <w:rPr>
-                <w:lang w:val="en-US"/>
-              </w:rPr>
-              <w:t xml:space="preserve">cellbg </w:t>
-            </w:r>
+            <w:proofErr w:type="spellStart"/>
+            <w:r>
+              <w:rPr>
+                <w:lang w:val="en-US"/>
+              </w:rPr>
+              <w:t>cellbg</w:t>
+            </w:r>
+            <w:proofErr w:type="spellEnd"/>
+            <w:r>
+              <w:rPr>
+                <w:lang w:val="en-US"/>
+              </w:rPr>
+              <w:t xml:space="preserve"> </w:t>
+            </w:r>
+            <w:proofErr w:type="spellStart"/>
+            <w:proofErr w:type="gramStart"/>
             <w:r>
               <w:rPr>
                 <w:lang w:val="en-US"/>
@@ -107,8 +136,17 @@
               <w:rPr>
                 <w:lang w:val="en-US"/>
               </w:rPr>
-              <w:t xml:space="preserve">.color %}{{ </w:t>
-            </w:r>
+              <w:t>.color</w:t>
+            </w:r>
+            <w:proofErr w:type="spellEnd"/>
+            <w:proofErr w:type="gramEnd"/>
+            <w:r>
+              <w:rPr>
+                <w:lang w:val="en-US"/>
+              </w:rPr>
+              <w:t xml:space="preserve"> %}{{ </w:t>
+            </w:r>
+            <w:proofErr w:type="spellStart"/>
             <w:r>
               <w:rPr>
                 <w:lang w:val="en-US"/>
@@ -127,6 +165,7 @@
               </w:rPr>
               <w:t>index</w:t>
             </w:r>
+            <w:proofErr w:type="spellEnd"/>
             <w:r>
               <w:rPr>
                 <w:lang w:val="en-US"/>
@@ -138,6 +177,12 @@
         <w:tc>
           <w:tcPr>
             <w:tcW w:w="3964" w:type="dxa"/>
+            <w:tcBorders>
+              <w:top w:val="single" w:sz="4" w:space="0" w:color="FFFFFF" w:themeColor="background1"/>
+              <w:left w:val="single" w:sz="4" w:space="0" w:color="FFFFFF" w:themeColor="background1"/>
+              <w:bottom w:val="single" w:sz="4" w:space="0" w:color="FFFFFF" w:themeColor="background1"/>
+              <w:right w:val="single" w:sz="4" w:space="0" w:color="FFFFFF" w:themeColor="background1"/>
+            </w:tcBorders>
             <w:vAlign w:val="center"/>
             <w:hideMark/>
           </w:tcPr>
@@ -145,18 +190,28 @@
             <w:pPr>
               <w:pStyle w:val="NoSpacing"/>
             </w:pPr>
-            <w:r>
-              <w:rPr>
-                <w:lang w:val="en-US"/>
-              </w:rPr>
-              <w:t>{{ level</w:t>
-            </w:r>
+            <w:proofErr w:type="gramStart"/>
+            <w:r>
+              <w:rPr>
+                <w:lang w:val="en-US"/>
+              </w:rPr>
+              <w:t xml:space="preserve">{{ </w:t>
+            </w:r>
+            <w:proofErr w:type="spellStart"/>
+            <w:r>
+              <w:rPr>
+                <w:lang w:val="en-US"/>
+              </w:rPr>
+              <w:t>level</w:t>
+            </w:r>
+            <w:proofErr w:type="gramEnd"/>
             <w:r>
               <w:rPr>
                 <w:lang w:val="en-US"/>
               </w:rPr>
               <w:t>.label</w:t>
             </w:r>
+            <w:proofErr w:type="spellEnd"/>
             <w:r>
               <w:rPr>
                 <w:lang w:val="en-US"/>
@@ -174,6 +229,11 @@
           <w:tcPr>
             <w:tcW w:w="4390" w:type="dxa"/>
             <w:gridSpan w:val="2"/>
+            <w:tcBorders>
+              <w:left w:val="single" w:sz="4" w:space="0" w:color="FFFFFF" w:themeColor="background1"/>
+              <w:bottom w:val="single" w:sz="4" w:space="0" w:color="FFFFFF" w:themeColor="background1"/>
+              <w:right w:val="single" w:sz="4" w:space="0" w:color="FFFFFF" w:themeColor="background1"/>
+            </w:tcBorders>
             <w:vAlign w:val="center"/>
           </w:tcPr>
           <w:p>

</xml_diff>

<commit_message>
[reporting][task]Removed SO_COLOR_PALETTE and using MaturityLevelModel, comment #639
</commit_message>
<xml_diff>
--- a/reporting/subdocs_templates/maturity_level_legend_template.docx
+++ b/reporting/subdocs_templates/maturity_level_legend_template.docx
@@ -19,8 +19,8 @@
         <w:tblLook w:val="04A0" w:firstRow="1" w:lastRow="0" w:firstColumn="1" w:lastColumn="0" w:noHBand="0" w:noVBand="1"/>
       </w:tblPr>
       <w:tblGrid>
-        <w:gridCol w:w="426"/>
-        <w:gridCol w:w="3964"/>
+        <w:gridCol w:w="340"/>
+        <w:gridCol w:w="4192"/>
       </w:tblGrid>
       <w:tr>
         <w:trPr>
@@ -28,7 +28,7 @@
         </w:trPr>
         <w:tc>
           <w:tcPr>
-            <w:tcW w:w="4390" w:type="dxa"/>
+            <w:tcW w:w="4532" w:type="dxa"/>
             <w:gridSpan w:val="2"/>
             <w:tcBorders>
               <w:top w:val="single" w:sz="4" w:space="0" w:color="FFFFFF" w:themeColor="background1"/>
@@ -60,7 +60,19 @@
               <w:rPr>
                 <w:lang w:val="en-US"/>
               </w:rPr>
-              <w:t xml:space="preserve"> for level in </w:t>
+              <w:t xml:space="preserve"> for </w:t>
+            </w:r>
+            <w:r>
+              <w:rPr>
+                <w:lang w:val="en-US"/>
+              </w:rPr>
+              <w:t>ml</w:t>
+            </w:r>
+            <w:r>
+              <w:rPr>
+                <w:lang w:val="en-US"/>
+              </w:rPr>
+              <w:t xml:space="preserve"> in </w:t>
             </w:r>
             <w:proofErr w:type="spellStart"/>
             <w:r>
@@ -81,11 +93,11 @@
       </w:tr>
       <w:tr>
         <w:trPr>
-          <w:trHeight w:hRule="exact" w:val="340"/>
+          <w:trHeight w:val="340"/>
         </w:trPr>
         <w:tc>
           <w:tcPr>
-            <w:tcW w:w="426" w:type="dxa"/>
+            <w:tcW w:w="340" w:type="dxa"/>
             <w:tcBorders>
               <w:top w:val="single" w:sz="4" w:space="0" w:color="FFFFFF" w:themeColor="background1"/>
               <w:left w:val="single" w:sz="4" w:space="0" w:color="FFFFFF" w:themeColor="background1"/>
@@ -130,7 +142,7 @@
               <w:rPr>
                 <w:lang w:val="en-US"/>
               </w:rPr>
-              <w:t>level</w:t>
+              <w:t>ml</w:t>
             </w:r>
             <w:r>
               <w:rPr>
@@ -151,19 +163,19 @@
               <w:rPr>
                 <w:lang w:val="en-US"/>
               </w:rPr>
+              <w:t>ml</w:t>
+            </w:r>
+            <w:r>
+              <w:rPr>
+                <w:lang w:val="en-US"/>
+              </w:rPr>
+              <w:t>.</w:t>
+            </w:r>
+            <w:r>
+              <w:rPr>
+                <w:lang w:val="en-US"/>
+              </w:rPr>
               <w:t>level</w:t>
-            </w:r>
-            <w:r>
-              <w:rPr>
-                <w:lang w:val="en-US"/>
-              </w:rPr>
-              <w:t>.</w:t>
-            </w:r>
-            <w:r>
-              <w:rPr>
-                <w:lang w:val="en-US"/>
-              </w:rPr>
-              <w:t>index</w:t>
             </w:r>
             <w:proofErr w:type="spellEnd"/>
             <w:r>
@@ -176,7 +188,7 @@
         </w:tc>
         <w:tc>
           <w:tcPr>
-            <w:tcW w:w="3964" w:type="dxa"/>
+            <w:tcW w:w="3965" w:type="dxa"/>
             <w:tcBorders>
               <w:top w:val="single" w:sz="4" w:space="0" w:color="FFFFFF" w:themeColor="background1"/>
               <w:left w:val="single" w:sz="4" w:space="0" w:color="FFFFFF" w:themeColor="background1"/>
@@ -202,7 +214,7 @@
               <w:rPr>
                 <w:lang w:val="en-US"/>
               </w:rPr>
-              <w:t>level</w:t>
+              <w:t>ml</w:t>
             </w:r>
             <w:proofErr w:type="gramEnd"/>
             <w:r>
@@ -227,7 +239,7 @@
         </w:trPr>
         <w:tc>
           <w:tcPr>
-            <w:tcW w:w="4390" w:type="dxa"/>
+            <w:tcW w:w="4532" w:type="dxa"/>
             <w:gridSpan w:val="2"/>
             <w:tcBorders>
               <w:left w:val="single" w:sz="4" w:space="0" w:color="FFFFFF" w:themeColor="background1"/>

</xml_diff>